<commit_message>
Fix DOCX Word repair warning
</commit_message>
<xml_diff>
--- a/examples/zero-to-one-sci-manuscript/complete-manuscript.docx
+++ b/examples/zero-to-one-sci-manuscript/complete-manuscript.docx
@@ -1,6 +1,6 @@
 
 <file path=word/document.xml><?xml version="1.0" encoding="utf-8"?>
-<w:document xmlns:ns1="http://schemas.openxmlformats.org/markup-compatibility/2006" xmlns:w="http://schemas.openxmlformats.org/wordprocessingml/2006/main" ns1:Ignorable="w14 wp14">
+<w:document xmlns:mc="http://schemas.openxmlformats.org/markup-compatibility/2006" xmlns:w="http://schemas.openxmlformats.org/wordprocessingml/2006/main" xmlns:w14="http://schemas.microsoft.com/office/word/2010/wordml" xmlns:wp14="http://schemas.microsoft.com/office/word/2010/wordprocessingDrawing" mc:Ignorable="w14 wp14">
   <w:body>
     <w:p>
       <w:pPr>
@@ -2597,7 +2597,7 @@
 </file>
 
 <file path=word/styles.xml><?xml version="1.0" encoding="utf-8"?>
-<w:styles xmlns:ns1="http://schemas.openxmlformats.org/markup-compatibility/2006" xmlns:w="http://schemas.openxmlformats.org/wordprocessingml/2006/main" ns1:Ignorable="w14">
+<w:styles xmlns:mc="http://schemas.openxmlformats.org/markup-compatibility/2006" xmlns:w="http://schemas.openxmlformats.org/wordprocessingml/2006/main" xmlns:w14="http://schemas.microsoft.com/office/word/2010/wordml" mc:Ignorable="w14">
   <w:docDefaults>
     <w:rPrDefault>
       <w:rPr>
@@ -2758,16 +2758,16 @@
     <w:name w:val="Normal"/>
     <w:qFormat/>
     <w:rsid w:val="00FC693F"/>
+    <w:pPr>
+      <w:spacing w:line="360" w:lineRule="auto"/>
+      <w:jc w:val="both"/>
+    </w:pPr>
     <w:rPr>
       <w:rFonts w:ascii="Times New Roman" w:hAnsi="Times New Roman" w:eastAsia="Times New Roman" w:cs="Times New Roman"/>
       <w:color w:val="000000"/>
       <w:sz w:val="24"/>
       <w:szCs w:val="24"/>
     </w:rPr>
-    <w:pPr>
-      <w:spacing w:line="360" w:lineRule="auto"/>
-      <w:jc w:val="both"/>
-    </w:pPr>
   </w:style>
   <w:style w:type="paragraph" w:styleId="Header">
     <w:name w:val="header"/>
@@ -3641,6 +3641,10 @@
     <w:uiPriority w:val="29"/>
     <w:qFormat/>
     <w:rsid w:val="00FC693F"/>
+    <w:pPr>
+      <w:spacing w:line="360" w:lineRule="auto"/>
+      <w:jc w:val="both"/>
+    </w:pPr>
     <w:rPr>
       <w:rFonts w:ascii="Times New Roman" w:hAnsi="Times New Roman" w:eastAsia="Times New Roman" w:cs="Times New Roman"/>
       <w:i/>
@@ -3649,10 +3653,6 @@
       <w:sz w:val="24"/>
       <w:szCs w:val="24"/>
     </w:rPr>
-    <w:pPr>
-      <w:spacing w:line="360" w:lineRule="auto"/>
-      <w:jc w:val="both"/>
-    </w:pPr>
   </w:style>
   <w:style w:type="character" w:customStyle="1" w:styleId="QuoteChar">
     <w:name w:val="Quote Char"/>

</xml_diff>